<commit_message>
docs: combined viva guide for Milestones 2 and 3
The instructor examines M2 and M3 together with open questions about
decisions. The new guide gives every chosen number and method with the
alternatives checked (tagged at the time / afterwards / not checked),
decision cards for D1-D5, P1-P7, F1-F4, the EDA choices and B1-B20, key
numbers, a question bank and a contributions table. The M3 reference now
covers files, concepts and limitations only; both references point to the guide.
</commit_message>
<xml_diff>
--- a/DS4SG_Script_and_Data_Reference.docx
+++ b/DS4SG_Script_and_Data_Reference.docx
@@ -58,7 +58,7 @@
           <w:sz w:val="22"/>
           <w:szCs w:val="22"/>
         </w:rPr>
-        <w:t xml:space="preserve">Version: 4 October 2026 (state of the repository after commit </w:t>
+        <w:t xml:space="preserve">Version: 26 October 2026 (the Milestone 1–2 pipeline as built at commit </w:t>
       </w:r>
       <w:r>
         <w:rPr>
@@ -113,7 +113,7 @@
     <w:sdt>
       <w:sdtPr>
         <w:alias w:val="Contents"/>
-        <w:id w:val="-497118880"/>
+        <w:id w:val="-121232762"/>
       </w:sdtPr>
       <w:sdtEndPr/>
       <w:sdtContent>
@@ -136,7 +136,7 @@
           <w:r>
             <w:fldChar w:fldCharType="separate"/>
           </w:r>
-          <w:hyperlink w:anchor="_Toc243855153" w:history="1">
+          <w:hyperlink w:anchor="_Toc243910279" w:history="1">
             <w:r>
               <w:rPr>
                 <w:rStyle w:val="Hyperlink"/>
@@ -160,7 +160,7 @@
               <w:rPr>
                 <w:noProof/>
               </w:rPr>
-              <w:instrText xml:space="preserve"> PAGEREF _Toc243855153 \h </w:instrText>
+              <w:instrText xml:space="preserve"> PAGEREF _Toc243910279 \h </w:instrText>
             </w:r>
             <w:r>
               <w:rPr>
@@ -197,7 +197,7 @@
               <w:noProof/>
             </w:rPr>
           </w:pPr>
-          <w:hyperlink w:anchor="_Toc243855154" w:history="1">
+          <w:hyperlink w:anchor="_Toc243910280" w:history="1">
             <w:r>
               <w:rPr>
                 <w:rStyle w:val="Hyperlink"/>
@@ -221,7 +221,7 @@
               <w:rPr>
                 <w:noProof/>
               </w:rPr>
-              <w:instrText xml:space="preserve"> PAGEREF _Toc243855154 \h </w:instrText>
+              <w:instrText xml:space="preserve"> PAGEREF _Toc243910280 \h </w:instrText>
             </w:r>
             <w:r>
               <w:rPr>
@@ -258,7 +258,7 @@
               <w:noProof/>
             </w:rPr>
           </w:pPr>
-          <w:hyperlink w:anchor="_Toc243855155" w:history="1">
+          <w:hyperlink w:anchor="_Toc243910281" w:history="1">
             <w:r>
               <w:rPr>
                 <w:rStyle w:val="Hyperlink"/>
@@ -282,7 +282,7 @@
               <w:rPr>
                 <w:noProof/>
               </w:rPr>
-              <w:instrText xml:space="preserve"> PAGEREF _Toc243855155 \h </w:instrText>
+              <w:instrText xml:space="preserve"> PAGEREF _Toc243910281 \h </w:instrText>
             </w:r>
             <w:r>
               <w:rPr>
@@ -319,7 +319,7 @@
               <w:noProof/>
             </w:rPr>
           </w:pPr>
-          <w:hyperlink w:anchor="_Toc243855156" w:history="1">
+          <w:hyperlink w:anchor="_Toc243910282" w:history="1">
             <w:r>
               <w:rPr>
                 <w:rStyle w:val="Hyperlink"/>
@@ -343,7 +343,7 @@
               <w:rPr>
                 <w:noProof/>
               </w:rPr>
-              <w:instrText xml:space="preserve"> PAGEREF _Toc243855156 \h </w:instrText>
+              <w:instrText xml:space="preserve"> PAGEREF _Toc243910282 \h </w:instrText>
             </w:r>
             <w:r>
               <w:rPr>
@@ -380,7 +380,7 @@
               <w:noProof/>
             </w:rPr>
           </w:pPr>
-          <w:hyperlink w:anchor="_Toc243855157" w:history="1">
+          <w:hyperlink w:anchor="_Toc243910283" w:history="1">
             <w:r>
               <w:rPr>
                 <w:rStyle w:val="Hyperlink"/>
@@ -404,7 +404,7 @@
               <w:rPr>
                 <w:noProof/>
               </w:rPr>
-              <w:instrText xml:space="preserve"> PAGEREF _Toc243855157 \h </w:instrText>
+              <w:instrText xml:space="preserve"> PAGEREF _Toc243910283 \h </w:instrText>
             </w:r>
             <w:r>
               <w:rPr>
@@ -441,7 +441,7 @@
               <w:noProof/>
             </w:rPr>
           </w:pPr>
-          <w:hyperlink w:anchor="_Toc243855158" w:history="1">
+          <w:hyperlink w:anchor="_Toc243910284" w:history="1">
             <w:r>
               <w:rPr>
                 <w:rStyle w:val="Hyperlink"/>
@@ -465,7 +465,7 @@
               <w:rPr>
                 <w:noProof/>
               </w:rPr>
-              <w:instrText xml:space="preserve"> PAGEREF _Toc243855158 \h </w:instrText>
+              <w:instrText xml:space="preserve"> PAGEREF _Toc243910284 \h </w:instrText>
             </w:r>
             <w:r>
               <w:rPr>
@@ -502,7 +502,7 @@
               <w:noProof/>
             </w:rPr>
           </w:pPr>
-          <w:hyperlink w:anchor="_Toc243855159" w:history="1">
+          <w:hyperlink w:anchor="_Toc243910285" w:history="1">
             <w:r>
               <w:rPr>
                 <w:rStyle w:val="Hyperlink"/>
@@ -526,7 +526,7 @@
               <w:rPr>
                 <w:noProof/>
               </w:rPr>
-              <w:instrText xml:space="preserve"> PAGEREF _Toc243855159 \h </w:instrText>
+              <w:instrText xml:space="preserve"> PAGEREF _Toc243910285 \h </w:instrText>
             </w:r>
             <w:r>
               <w:rPr>
@@ -563,7 +563,7 @@
               <w:noProof/>
             </w:rPr>
           </w:pPr>
-          <w:hyperlink w:anchor="_Toc243855160" w:history="1">
+          <w:hyperlink w:anchor="_Toc243910286" w:history="1">
             <w:r>
               <w:rPr>
                 <w:rStyle w:val="Hyperlink"/>
@@ -587,7 +587,7 @@
               <w:rPr>
                 <w:noProof/>
               </w:rPr>
-              <w:instrText xml:space="preserve"> PAGEREF _Toc243855160 \h </w:instrText>
+              <w:instrText xml:space="preserve"> PAGEREF _Toc243910286 \h </w:instrText>
             </w:r>
             <w:r>
               <w:rPr>
@@ -624,7 +624,7 @@
               <w:noProof/>
             </w:rPr>
           </w:pPr>
-          <w:hyperlink w:anchor="_Toc243855161" w:history="1">
+          <w:hyperlink w:anchor="_Toc243910287" w:history="1">
             <w:r>
               <w:rPr>
                 <w:rStyle w:val="Hyperlink"/>
@@ -648,7 +648,7 @@
               <w:rPr>
                 <w:noProof/>
               </w:rPr>
-              <w:instrText xml:space="preserve"> PAGEREF _Toc243855161 \h </w:instrText>
+              <w:instrText xml:space="preserve"> PAGEREF _Toc243910287 \h </w:instrText>
             </w:r>
             <w:r>
               <w:rPr>
@@ -685,7 +685,7 @@
               <w:noProof/>
             </w:rPr>
           </w:pPr>
-          <w:hyperlink w:anchor="_Toc243855162" w:history="1">
+          <w:hyperlink w:anchor="_Toc243910288" w:history="1">
             <w:r>
               <w:rPr>
                 <w:rStyle w:val="Hyperlink"/>
@@ -709,7 +709,7 @@
               <w:rPr>
                 <w:noProof/>
               </w:rPr>
-              <w:instrText xml:space="preserve"> PAGEREF _Toc243855162 \h </w:instrText>
+              <w:instrText xml:space="preserve"> PAGEREF _Toc243910288 \h </w:instrText>
             </w:r>
             <w:r>
               <w:rPr>
@@ -746,7 +746,7 @@
               <w:noProof/>
             </w:rPr>
           </w:pPr>
-          <w:hyperlink w:anchor="_Toc243855163" w:history="1">
+          <w:hyperlink w:anchor="_Toc243910289" w:history="1">
             <w:r>
               <w:rPr>
                 <w:rStyle w:val="Hyperlink"/>
@@ -770,7 +770,7 @@
               <w:rPr>
                 <w:noProof/>
               </w:rPr>
-              <w:instrText xml:space="preserve"> PAGEREF _Toc243855163 \h </w:instrText>
+              <w:instrText xml:space="preserve"> PAGEREF _Toc243910289 \h </w:instrText>
             </w:r>
             <w:r>
               <w:rPr>
@@ -807,7 +807,7 @@
               <w:noProof/>
             </w:rPr>
           </w:pPr>
-          <w:hyperlink w:anchor="_Toc243855164" w:history="1">
+          <w:hyperlink w:anchor="_Toc243910290" w:history="1">
             <w:r>
               <w:rPr>
                 <w:rStyle w:val="Hyperlink"/>
@@ -831,7 +831,7 @@
               <w:rPr>
                 <w:noProof/>
               </w:rPr>
-              <w:instrText xml:space="preserve"> PAGEREF _Toc243855164 \h </w:instrText>
+              <w:instrText xml:space="preserve"> PAGEREF _Toc243910290 \h </w:instrText>
             </w:r>
             <w:r>
               <w:rPr>
@@ -868,7 +868,7 @@
               <w:noProof/>
             </w:rPr>
           </w:pPr>
-          <w:hyperlink w:anchor="_Toc243855165" w:history="1">
+          <w:hyperlink w:anchor="_Toc243910291" w:history="1">
             <w:r>
               <w:rPr>
                 <w:rStyle w:val="Hyperlink"/>
@@ -892,7 +892,7 @@
               <w:rPr>
                 <w:noProof/>
               </w:rPr>
-              <w:instrText xml:space="preserve"> PAGEREF _Toc243855165 \h </w:instrText>
+              <w:instrText xml:space="preserve"> PAGEREF _Toc243910291 \h </w:instrText>
             </w:r>
             <w:r>
               <w:rPr>
@@ -929,7 +929,7 @@
               <w:noProof/>
             </w:rPr>
           </w:pPr>
-          <w:hyperlink w:anchor="_Toc243855166" w:history="1">
+          <w:hyperlink w:anchor="_Toc243910292" w:history="1">
             <w:r>
               <w:rPr>
                 <w:rStyle w:val="Hyperlink"/>
@@ -953,7 +953,7 @@
               <w:rPr>
                 <w:noProof/>
               </w:rPr>
-              <w:instrText xml:space="preserve"> PAGEREF _Toc243855166 \h </w:instrText>
+              <w:instrText xml:space="preserve"> PAGEREF _Toc243910292 \h </w:instrText>
             </w:r>
             <w:r>
               <w:rPr>
@@ -996,7 +996,7 @@
       <w:pPr>
         <w:pStyle w:val="Heading1"/>
       </w:pPr>
-      <w:bookmarkStart w:id="0" w:name="_Toc243855153"/>
+      <w:bookmarkStart w:id="0" w:name="_Toc243910279"/>
       <w:r>
         <w:lastRenderedPageBreak/>
         <w:t>1. How to read this document</w:t>
@@ -1314,9 +1314,58 @@
     </w:p>
     <w:p>
       <w:pPr>
+        <w:spacing w:before="120" w:after="120"/>
+      </w:pPr>
+      <w:r>
+        <w:rPr>
+          <w:b/>
+          <w:bCs/>
+          <w:color w:val="1F1F1F"/>
+        </w:rPr>
+        <w:t>For the viva:</w:t>
+      </w:r>
+      <w:r>
+        <w:rPr>
+          <w:color w:val="1F1F1F"/>
+        </w:rPr>
+        <w:t xml:space="preserve"> the reasons behind the Milestone 2 choices (cleaning decisions D1–D5, preparation decisions P1–P7, feature decisions F1–F4 and the EDA and hypothesis choices), the other values and methods we checked, and a question bank are in </w:t>
+      </w:r>
+      <w:r>
+        <w:rPr>
+          <w:rFonts w:ascii="Consolas" w:eastAsia="Consolas" w:hAnsi="Consolas" w:cs="Consolas"/>
+          <w:color w:val="1F1F1F"/>
+          <w:sz w:val="18"/>
+          <w:szCs w:val="18"/>
+        </w:rPr>
+        <w:t>DS4SG_Viva_Guide_M2_M3.docx</w:t>
+      </w:r>
+      <w:r>
+        <w:rPr>
+          <w:color w:val="1F1F1F"/>
+        </w:rPr>
+        <w:t xml:space="preserve">, together with Milestone 3. Milestone 3's files are described in </w:t>
+      </w:r>
+      <w:r>
+        <w:rPr>
+          <w:rFonts w:ascii="Consolas" w:eastAsia="Consolas" w:hAnsi="Consolas" w:cs="Consolas"/>
+          <w:color w:val="1F1F1F"/>
+          <w:sz w:val="18"/>
+          <w:szCs w:val="18"/>
+        </w:rPr>
+        <w:t>DS4SG_M3_Reference.docx</w:t>
+      </w:r>
+      <w:r>
+        <w:rPr>
+          <w:color w:val="1F1F1F"/>
+        </w:rPr>
+        <w:t>.</w:t>
+      </w:r>
+    </w:p>
+    <w:p>
+      <w:pPr>
         <w:pStyle w:val="Heading1"/>
       </w:pPr>
-      <w:bookmarkStart w:id="1" w:name="_Toc243855154"/>
+      <w:bookmarkStart w:id="1" w:name="_Toc243910280"/>
       <w:r>
         <w:t>2. Pipeline overview: run order and data flow</w:t>
       </w:r>
@@ -2117,6 +2166,7 @@
                 <w:sz w:val="17"/>
                 <w:szCs w:val="17"/>
               </w:rPr>
+              <w:lastRenderedPageBreak/>
               <w:t>4</w:t>
             </w:r>
           </w:p>
@@ -2400,7 +2450,6 @@
                 <w:sz w:val="17"/>
                 <w:szCs w:val="17"/>
               </w:rPr>
-              <w:lastRenderedPageBreak/>
               <w:t>6</w:t>
             </w:r>
           </w:p>
@@ -3891,7 +3940,7 @@
       <w:pPr>
         <w:pStyle w:val="Heading1"/>
       </w:pPr>
-      <w:bookmarkStart w:id="2" w:name="_Toc243855155"/>
+      <w:bookmarkStart w:id="2" w:name="_Toc243910281"/>
       <w:r>
         <w:lastRenderedPageBreak/>
         <w:t>3. Scripts and notebooks</w:t>
@@ -9837,7 +9886,7 @@
         <w:pStyle w:val="Heading2"/>
         <w:spacing w:before="240"/>
       </w:pPr>
-      <w:bookmarkStart w:id="3" w:name="_Toc243855156"/>
+      <w:bookmarkStart w:id="3" w:name="_Toc243910282"/>
       <w:r>
         <w:t>Support files</w:t>
       </w:r>
@@ -10250,7 +10299,7 @@
       <w:pPr>
         <w:pStyle w:val="Heading1"/>
       </w:pPr>
-      <w:bookmarkStart w:id="4" w:name="_Toc243855157"/>
+      <w:bookmarkStart w:id="4" w:name="_Toc243910283"/>
       <w:r>
         <w:lastRenderedPageBreak/>
         <w:t>4. Data files</w:t>
@@ -10262,7 +10311,7 @@
         <w:pStyle w:val="Heading2"/>
         <w:spacing w:before="240"/>
       </w:pPr>
-      <w:bookmarkStart w:id="5" w:name="_Toc243855158"/>
+      <w:bookmarkStart w:id="5" w:name="_Toc243910284"/>
       <w:r>
         <w:t>4.1 Raw data (data/raw/)</w:t>
       </w:r>
@@ -14511,7 +14560,7 @@
         <w:pStyle w:val="Heading2"/>
         <w:spacing w:before="240"/>
       </w:pPr>
-      <w:bookmarkStart w:id="6" w:name="_Toc243855159"/>
+      <w:bookmarkStart w:id="6" w:name="_Toc243910285"/>
       <w:r>
         <w:t>4.2 External and lookup data (data/external/)</w:t>
       </w:r>
@@ -17280,7 +17329,7 @@
         <w:pStyle w:val="Heading2"/>
         <w:spacing w:before="240"/>
       </w:pPr>
-      <w:bookmarkStart w:id="7" w:name="_Toc243855160"/>
+      <w:bookmarkStart w:id="7" w:name="_Toc243910286"/>
       <w:r>
         <w:t>4.3 Interim data (data/interim/)</w:t>
       </w:r>
@@ -19172,7 +19221,7 @@
         <w:pStyle w:val="Heading2"/>
         <w:spacing w:before="240"/>
       </w:pPr>
-      <w:bookmarkStart w:id="8" w:name="_Toc243855161"/>
+      <w:bookmarkStart w:id="8" w:name="_Toc243910287"/>
       <w:r>
         <w:t>4.4 Processed data (data/processed/)</w:t>
       </w:r>
@@ -23055,7 +23104,7 @@
       <w:pPr>
         <w:pStyle w:val="Heading1"/>
       </w:pPr>
-      <w:bookmarkStart w:id="9" w:name="_Toc243855162"/>
+      <w:bookmarkStart w:id="9" w:name="_Toc243910288"/>
       <w:r>
         <w:lastRenderedPageBreak/>
         <w:t>5. Output files (reports/)</w:t>
@@ -23067,7 +23116,7 @@
         <w:pStyle w:val="Heading2"/>
         <w:spacing w:before="240"/>
       </w:pPr>
-      <w:bookmarkStart w:id="10" w:name="_Toc243855163"/>
+      <w:bookmarkStart w:id="10" w:name="_Toc243910289"/>
       <w:r>
         <w:t>5.1 Figures (reports/figures/)</w:t>
       </w:r>
@@ -24029,7 +24078,7 @@
         <w:pStyle w:val="Heading2"/>
         <w:spacing w:before="240"/>
       </w:pPr>
-      <w:bookmarkStart w:id="11" w:name="_Toc243855164"/>
+      <w:bookmarkStart w:id="11" w:name="_Toc243910290"/>
       <w:r>
         <w:t>5.2 Tables (reports/tables/)</w:t>
       </w:r>
@@ -25890,7 +25939,7 @@
       <w:pPr>
         <w:pStyle w:val="Heading1"/>
       </w:pPr>
-      <w:bookmarkStart w:id="12" w:name="_Toc243855165"/>
+      <w:bookmarkStart w:id="12" w:name="_Toc243910291"/>
       <w:r>
         <w:t>6. Documentation, configuration and other files</w:t>
       </w:r>
@@ -27302,7 +27351,7 @@
       <w:pPr>
         <w:pStyle w:val="Heading1"/>
       </w:pPr>
-      <w:bookmarkStart w:id="13" w:name="_Toc243855166"/>
+      <w:bookmarkStart w:id="13" w:name="_Toc243910292"/>
       <w:r>
         <w:lastRenderedPageBreak/>
         <w:t>7. Cross-reference matrix: data files x scripts</w:t>
@@ -36821,68 +36870,10 @@
 <file path=word/numbering.xml><?xml version="1.0" encoding="utf-8"?>
 <w:numbering xmlns:wpc="http://schemas.microsoft.com/office/word/2010/wordprocessingCanvas" xmlns:cx="http://schemas.microsoft.com/office/drawing/2014/chartex" xmlns:cx1="http://schemas.microsoft.com/office/drawing/2015/9/8/chartex" xmlns:cx2="http://schemas.microsoft.com/office/drawing/2015/10/21/chartex" xmlns:cx3="http://schemas.microsoft.com/office/drawing/2016/5/9/chartex" xmlns:cx4="http://schemas.microsoft.com/office/drawing/2016/5/10/chartex" xmlns:cx5="http://schemas.microsoft.com/office/drawing/2016/5/11/chartex" xmlns:cx6="http://schemas.microsoft.com/office/drawing/2016/5/12/chartex" xmlns:cx7="http://schemas.microsoft.com/office/drawing/2016/5/13/chartex" xmlns:cx8="http://schemas.microsoft.com/office/drawing/2016/5/14/chartex" xmlns:mc="http://schemas.openxmlformats.org/markup-compatibility/2006" xmlns:aink="http://schemas.microsoft.com/office/drawing/2016/ink" xmlns:am3d="http://schemas.microsoft.com/office/drawing/2017/model3d" xmlns:o="urn:schemas-microsoft-com:office:office" xmlns:oel="http://schemas.microsoft.com/office/2019/extlst" xmlns:r="http://schemas.openxmlformats.org/officeDocument/2006/relationships" xmlns:m="http://schemas.openxmlformats.org/officeDocument/2006/math" xmlns:v="urn:schemas-microsoft-com:vml" xmlns:wp14="http://schemas.microsoft.com/office/word/2010/wordprocessingDrawing" xmlns:wp="http://schemas.openxmlformats.org/drawingml/2006/wordprocessingDrawing" xmlns:w10="urn:schemas-microsoft-com:office:word" xmlns:w="http://schemas.openxmlformats.org/wordprocessingml/2006/main" xmlns:w14="http://schemas.microsoft.com/office/word/2010/wordml" xmlns:w15="http://schemas.microsoft.com/office/word/2012/wordml" xmlns:w16cex="http://schemas.microsoft.com/office/word/2018/wordml/cex" xmlns:w16cid="http://schemas.microsoft.com/office/word/2016/wordml/cid" xmlns:w16="http://schemas.microsoft.com/office/word/2018/wordml" xmlns:w16du="http://schemas.microsoft.com/office/word/2023/wordml/word16du" xmlns:w16sdtdh="http://schemas.microsoft.com/office/word/2020/wordml/sdtdatahash" xmlns:w16sdtfl="http://schemas.microsoft.com/office/word/2024/wordml/sdtformatlock" xmlns:w16se="http://schemas.microsoft.com/office/word/2015/wordml/symex" xmlns:wpg="http://schemas.microsoft.com/office/word/2010/wordprocessingGroup" xmlns:wpi="http://schemas.microsoft.com/office/word/2010/wordprocessingInk" xmlns:wne="http://schemas.microsoft.com/office/word/2006/wordml" xmlns:wps="http://schemas.microsoft.com/office/word/2010/wordprocessingShape" mc:Ignorable="w14 w15 w16se w16cid w16 w16cex w16sdtdh w16sdtfl w16du wp14">
   <w:abstractNum w:abstractNumId="0" w15:restartNumberingAfterBreak="0">
-    <w:nsid w:val="0786599A"/>
+    <w:nsid w:val="096B0344"/>
     <w:multiLevelType w:val="hybridMultilevel"/>
-    <w:tmpl w:val="490006A0"/>
-    <w:lvl w:ilvl="0" w:tplc="7D70A826">
-      <w:start w:val="1"/>
-      <w:numFmt w:val="bullet"/>
-      <w:lvlText w:val="•"/>
-      <w:lvlJc w:val="left"/>
-      <w:pPr>
-        <w:ind w:left="540" w:hanging="270"/>
-      </w:pPr>
-    </w:lvl>
-    <w:lvl w:ilvl="1" w:tplc="41829A78" w:tentative="1">
-      <w:start w:val="1"/>
-      <w:numFmt w:val="bullet"/>
-      <w:lvlText w:val="–"/>
-      <w:lvlJc w:val="left"/>
-      <w:pPr>
-        <w:ind w:left="1080" w:hanging="270"/>
-      </w:pPr>
-    </w:lvl>
-    <w:lvl w:ilvl="2" w:tplc="9710D44A">
-      <w:numFmt w:val="decimal"/>
-      <w:lvlText w:val=""/>
-      <w:lvlJc w:val="left"/>
-    </w:lvl>
-    <w:lvl w:ilvl="3" w:tplc="A67A2052">
-      <w:numFmt w:val="decimal"/>
-      <w:lvlText w:val=""/>
-      <w:lvlJc w:val="left"/>
-    </w:lvl>
-    <w:lvl w:ilvl="4" w:tplc="35A8E9E6">
-      <w:numFmt w:val="decimal"/>
-      <w:lvlText w:val=""/>
-      <w:lvlJc w:val="left"/>
-    </w:lvl>
-    <w:lvl w:ilvl="5" w:tplc="B608E610">
-      <w:numFmt w:val="decimal"/>
-      <w:lvlText w:val=""/>
-      <w:lvlJc w:val="left"/>
-    </w:lvl>
-    <w:lvl w:ilvl="6" w:tplc="985A5988">
-      <w:numFmt w:val="decimal"/>
-      <w:lvlText w:val=""/>
-      <w:lvlJc w:val="left"/>
-    </w:lvl>
-    <w:lvl w:ilvl="7" w:tplc="18D281E2">
-      <w:numFmt w:val="decimal"/>
-      <w:lvlText w:val=""/>
-      <w:lvlJc w:val="left"/>
-    </w:lvl>
-    <w:lvl w:ilvl="8" w:tplc="2C947304">
-      <w:numFmt w:val="decimal"/>
-      <w:lvlText w:val=""/>
-      <w:lvlJc w:val="left"/>
-    </w:lvl>
-  </w:abstractNum>
-  <w:abstractNum w:abstractNumId="1" w15:restartNumberingAfterBreak="0">
-    <w:nsid w:val="36730D53"/>
-    <w:multiLevelType w:val="hybridMultilevel"/>
-    <w:tmpl w:val="2D62809C"/>
-    <w:lvl w:ilvl="0" w:tplc="4C20F72E" w:tentative="1">
+    <w:tmpl w:val="50C62814"/>
+    <w:lvl w:ilvl="0" w:tplc="01600AE0" w:tentative="1">
       <w:start w:val="1"/>
       <w:numFmt w:val="bullet"/>
       <w:lvlText w:val="●"/>
@@ -36891,7 +36882,7 @@
         <w:ind w:left="720" w:hanging="360"/>
       </w:pPr>
     </w:lvl>
-    <w:lvl w:ilvl="1" w:tplc="54A83C84" w:tentative="1">
+    <w:lvl w:ilvl="1" w:tplc="716A60D0" w:tentative="1">
       <w:start w:val="1"/>
       <w:numFmt w:val="bullet"/>
       <w:lvlText w:val="○"/>
@@ -36900,7 +36891,7 @@
         <w:ind w:left="1440" w:hanging="360"/>
       </w:pPr>
     </w:lvl>
-    <w:lvl w:ilvl="2" w:tplc="1B32C722" w:tentative="1">
+    <w:lvl w:ilvl="2" w:tplc="9ED85540" w:tentative="1">
       <w:start w:val="1"/>
       <w:numFmt w:val="bullet"/>
       <w:lvlText w:val="■"/>
@@ -36909,7 +36900,7 @@
         <w:ind w:left="2160" w:hanging="360"/>
       </w:pPr>
     </w:lvl>
-    <w:lvl w:ilvl="3" w:tplc="E7FC4E20" w:tentative="1">
+    <w:lvl w:ilvl="3" w:tplc="04CC48EA" w:tentative="1">
       <w:start w:val="1"/>
       <w:numFmt w:val="bullet"/>
       <w:lvlText w:val="●"/>
@@ -36918,7 +36909,7 @@
         <w:ind w:left="2880" w:hanging="360"/>
       </w:pPr>
     </w:lvl>
-    <w:lvl w:ilvl="4" w:tplc="773001DE" w:tentative="1">
+    <w:lvl w:ilvl="4" w:tplc="90C692DA" w:tentative="1">
       <w:start w:val="1"/>
       <w:numFmt w:val="bullet"/>
       <w:lvlText w:val="○"/>
@@ -36927,7 +36918,7 @@
         <w:ind w:left="3600" w:hanging="360"/>
       </w:pPr>
     </w:lvl>
-    <w:lvl w:ilvl="5" w:tplc="F54C0C1E" w:tentative="1">
+    <w:lvl w:ilvl="5" w:tplc="4830B6E8" w:tentative="1">
       <w:start w:val="1"/>
       <w:numFmt w:val="bullet"/>
       <w:lvlText w:val="■"/>
@@ -36936,7 +36927,7 @@
         <w:ind w:left="4320" w:hanging="360"/>
       </w:pPr>
     </w:lvl>
-    <w:lvl w:ilvl="6" w:tplc="3ED4CA4C" w:tentative="1">
+    <w:lvl w:ilvl="6" w:tplc="8CD40D0C" w:tentative="1">
       <w:start w:val="1"/>
       <w:numFmt w:val="bullet"/>
       <w:lvlText w:val="●"/>
@@ -36945,7 +36936,7 @@
         <w:ind w:left="5040" w:hanging="360"/>
       </w:pPr>
     </w:lvl>
-    <w:lvl w:ilvl="7" w:tplc="4A94846E" w:tentative="1">
+    <w:lvl w:ilvl="7" w:tplc="C066C208" w:tentative="1">
       <w:start w:val="1"/>
       <w:numFmt w:val="bullet"/>
       <w:lvlText w:val="●"/>
@@ -36954,7 +36945,7 @@
         <w:ind w:left="5760" w:hanging="360"/>
       </w:pPr>
     </w:lvl>
-    <w:lvl w:ilvl="8" w:tplc="E21AB192" w:tentative="1">
+    <w:lvl w:ilvl="8" w:tplc="4030FF3A" w:tentative="1">
       <w:start w:val="1"/>
       <w:numFmt w:val="bullet"/>
       <w:lvlText w:val="●"/>
@@ -36964,14 +36955,72 @@
       </w:pPr>
     </w:lvl>
   </w:abstractNum>
-  <w:num w:numId="1" w16cid:durableId="1214275888">
-    <w:abstractNumId w:val="1"/>
+  <w:abstractNum w:abstractNumId="1" w15:restartNumberingAfterBreak="0">
+    <w:nsid w:val="673F2B89"/>
+    <w:multiLevelType w:val="hybridMultilevel"/>
+    <w:tmpl w:val="9F529FF6"/>
+    <w:lvl w:ilvl="0" w:tplc="0B9EECDA">
+      <w:start w:val="1"/>
+      <w:numFmt w:val="bullet"/>
+      <w:lvlText w:val="•"/>
+      <w:lvlJc w:val="left"/>
+      <w:pPr>
+        <w:ind w:left="540" w:hanging="270"/>
+      </w:pPr>
+    </w:lvl>
+    <w:lvl w:ilvl="1" w:tplc="14E269C2" w:tentative="1">
+      <w:start w:val="1"/>
+      <w:numFmt w:val="bullet"/>
+      <w:lvlText w:val="–"/>
+      <w:lvlJc w:val="left"/>
+      <w:pPr>
+        <w:ind w:left="1080" w:hanging="270"/>
+      </w:pPr>
+    </w:lvl>
+    <w:lvl w:ilvl="2" w:tplc="CFF8E6A8">
+      <w:numFmt w:val="decimal"/>
+      <w:lvlText w:val=""/>
+      <w:lvlJc w:val="left"/>
+    </w:lvl>
+    <w:lvl w:ilvl="3" w:tplc="4B4C011C">
+      <w:numFmt w:val="decimal"/>
+      <w:lvlText w:val=""/>
+      <w:lvlJc w:val="left"/>
+    </w:lvl>
+    <w:lvl w:ilvl="4" w:tplc="E16ED736">
+      <w:numFmt w:val="decimal"/>
+      <w:lvlText w:val=""/>
+      <w:lvlJc w:val="left"/>
+    </w:lvl>
+    <w:lvl w:ilvl="5" w:tplc="AE5C89C2">
+      <w:numFmt w:val="decimal"/>
+      <w:lvlText w:val=""/>
+      <w:lvlJc w:val="left"/>
+    </w:lvl>
+    <w:lvl w:ilvl="6" w:tplc="42F89236">
+      <w:numFmt w:val="decimal"/>
+      <w:lvlText w:val=""/>
+      <w:lvlJc w:val="left"/>
+    </w:lvl>
+    <w:lvl w:ilvl="7" w:tplc="CCC2CBA4">
+      <w:numFmt w:val="decimal"/>
+      <w:lvlText w:val=""/>
+      <w:lvlJc w:val="left"/>
+    </w:lvl>
+    <w:lvl w:ilvl="8" w:tplc="FE521D0E">
+      <w:numFmt w:val="decimal"/>
+      <w:lvlText w:val=""/>
+      <w:lvlJc w:val="left"/>
+    </w:lvl>
+  </w:abstractNum>
+  <w:num w:numId="1" w16cid:durableId="664748591">
+    <w:abstractNumId w:val="0"/>
     <w:lvlOverride w:ilvl="0">
       <w:startOverride w:val="1"/>
     </w:lvlOverride>
   </w:num>
-  <w:num w:numId="2" w16cid:durableId="1992253573">
-    <w:abstractNumId w:val="0"/>
+  <w:num w:numId="2" w16cid:durableId="2012171921">
+    <w:abstractNumId w:val="1"/>
     <w:lvlOverride w:ilvl="0">
       <w:startOverride w:val="1"/>
     </w:lvlOverride>
@@ -37603,7 +37652,7 @@
     <w:autoRedefine/>
     <w:uiPriority w:val="39"/>
     <w:unhideWhenUsed/>
-    <w:rsid w:val="004F0125"/>
+    <w:rsid w:val="00C31EEB"/>
     <w:pPr>
       <w:spacing w:after="100"/>
     </w:pPr>
@@ -37615,7 +37664,7 @@
     <w:autoRedefine/>
     <w:uiPriority w:val="39"/>
     <w:unhideWhenUsed/>
-    <w:rsid w:val="004F0125"/>
+    <w:rsid w:val="00C31EEB"/>
     <w:pPr>
       <w:spacing w:after="100"/>
       <w:ind w:left="200"/>

</xml_diff>